<commit_message>
research: publish repaired Hurst ablation v3 rerun and documents
</commit_message>
<xml_diff>
--- a/docs/XAUUSD_Hurst_Forecasting_Journal.docx
+++ b/docs/XAUUSD_Hurst_Forecasting_Journal.docx
@@ -170,18 +170,17 @@
                 <w:color w:val="000000"/>
                 <w:sz w:val="16"/>
               </w:rPr>
-              <w:t>Abstract</w:t>
-            </w:r>
-          </w:p>
-          <w:p>
-            <w:pPr>
-              <w:spacing w:after="0" w:line="240" w:lineRule="auto"/>
-            </w:pPr>
-            <w:r>
-              <w:rPr>
-                <w:sz w:val="16"/>
-              </w:rPr>
-              <w:t>Gold direction forecasts are often assessed using the best observed accuracy or random cross-validation, making claims about the incremental value of individual features difficult to interpret. This study examines whether causal Hurst-based regime features provide stable predictive value for multi-horizon XAUUSD direction forecasting within a fixed machine-learning pipeline. The dataset comprises 4,017 daily XAUUSD observations from MetaQuotes-Demo spanning 3 January 2011 to 31 July 2026. Four forecast horizons (1, 5, 10, and 20 days) are evaluated using a locked historical boundary of 3 July 2023, purged walk-forward splits, and development-only model and threshold selection. Hurst features are computed causally using first-order detrended fluctuation analysis over 64- and 128-day windows and are compared with both a no-Hurst baseline and a robust regime representation. In the previously observed historical holdout, balanced accuracy ranged from 50.38% to 52.19%, and all four pre-specified decisions were rejected. The 12-trial ablation likewise showed no stable advantage from Hurst features; the highest point estimate was 52.03% balanced accuracy for the no-Hurst arm at the one-day horizon. A subsequent audit identified incomplete overlap removal between a secondary calibration interval and the evaluation interval in all 60 outer selections, with sigmoid calibration selected 26 times. Consequently, the ablation results are reported as descriptive development evidence rather than confirmatory leakage-free estimates. Although 82 automated tests passed, technical quality assurance does not establish statistical or economic validity. Given these data and this evaluation protocol, the results do not support stable directional skill, incremental predictive value from Hurst features, or trading profitability. The study contributes an auditable negative result and a reproducible evaluation framework.</w:t>
+              <w:t>Gold direction forecasts are often assessed using the best observed accuracy or random cross-validation, making claims about the incremental value of individual features difficult to interpret. This study examines whether causal Hurst-based regime features provide stable predictive value for multi-horizon XAUUSD direction forecasting within a fixed machine-learning pipeline. The dataset comprises 4,017 daily XAUUSD observations from MetaQuotes-Demo spanning 3 January 2011 to 31 July 2026. Four forecast horizons (1, 5, 10, and 20 days) are evaluated using a locked historical boundary of 3 July 2023, purged walk-forward splits, and development-only model and threshold selection. Hurst features are computed causally using first-order detrended fluctuation analysis over 64- and 128-day windows and are compared with a no-Hurst baseline and a robust regime representation. The repaired v3 rerun contains 12 trials across three arms and verifies zero secondary calibration overlap in all 60 outer selections. Pooled balanced accuracy for no Hurst is 52.31%, 49.72%, 50.74%, and 49.93% across the four horizons; the corresponding DFA1-Hurst values are 50.82%, 48.78%, 47.52%, and 47.31%. Paired DFA1-minus-no-Hurst contrasts are negative at every horizon, all 95% intervals include zero, and all Holm-adjusted p-values equal 0.449955. All 12 promotion decisions were rejected. Because the historical period was previously observed and provenance_complete=false, these results are repaired development evidence rather than prospective confirmation. The study contributes an auditable negative result and a reproducible evaluation framework.</w:t>
+            </w:r>
+          </w:p>
+          <w:p>
+            <w:pPr>
+              <w:spacing w:after="0" w:line="240" w:lineRule="auto"/>
+            </w:pPr>
+            <w:r>
+              <w:rPr>
+                <w:sz w:val="16"/>
+              </w:rPr>
             </w:r>
           </w:p>
           <w:p>
@@ -194,13 +193,6 @@
                 <w:b/>
                 <w:sz w:val="16"/>
               </w:rPr>
-              <w:t xml:space="preserve">Keywords: </w:t>
-            </w:r>
-            <w:r>
-              <w:rPr>
-                <w:sz w:val="16"/>
-              </w:rPr>
-              <w:t>XAUUSD; gold direction forecasting; Hurst exponent; detrended fluctuation analysis; purged walk-forward validation; machine learning; reproducibility</w:t>
             </w:r>
           </w:p>
         </w:tc>
@@ -246,8 +238,7 @@
     </w:p>
     <w:p>
       <w:r>
-        <w:lastRenderedPageBreak/>
-        <w:t>The scope of the contribution is deliberately limited. The study provides a common-calendar, multi-horizon comparison; distinguishes a statistical close-to-close target from an executable next-open target; evaluates two Hurst representations against a no-Hurst control arm; records data and output hashes; and reports a negative result after a scientific audit identified a calibration-boundary defect. Accordingly, the contribution is an auditable evaluation of a plausible feature hypothesis rather than a claim that Hurst-based modeling can reliably forecast or trade gold.</w:t>
+        <w:t>The scope of the contribution is deliberately limited. The study provides a common-calendar, multi-horizon comparison; distinguishes a statistical close-to-close target from an executable next-open target; evaluates two Hurst representations against a no-Hurst control arm; records data and output hashes; and reports a repaired, fully rerun ablation with paired inference. Accordingly, the contribution is an auditable evaluation of a plausible feature hypothesis rather than a claim that Hurst-based modeling can reliably forecast or trade gold.</w:t>
       </w:r>
     </w:p>
     <w:p>
@@ -294,7 +285,7 @@
     </w:p>
     <w:p>
       <w:r>
-        <w:t>In the present study, the first-order detrended fluctuation analysis (DFA1) estimator follows the long-range-correlation framework described by Kantelhardt et al. (2001). The estimator is used as a causal regime descriptor rather than as a hard rule that treats H &gt; 0.5 as an upward signal. This distinction is important because persistence in a price or return process can coexist with a weak or unstable relationship to the sign of a future return.</w:t>
+        <w:t>In the present study, the first-order detrended fluctuation analysis (DFA1) estimator follows the long-range-correlation framework described by Kantelhardt et al. (2001). It is applied causally to first differences of log price using rolling windows of 64 and 128 observations. After demeaning and cumulative profiling, non-overlapping segments are linearly detrended at scales from 4 through floor(n_increments/3), with at least 32 observations and three valid scales. A 1e-12 standard-deviation floor prevents numerical failure. A robust regime representation uses a 252-observation history, a minimum of 126 observations, and rolling 0.33/0.67 historical quantiles. Both are regime descriptors, not directional rules such as H &gt; 0.5 implying an upward forecast.</w:t>
       </w:r>
     </w:p>
     <w:p>
@@ -313,7 +304,7 @@
     </w:p>
     <w:p>
       <w:r>
-        <w:t>The present protocol adopts these principles as design constraints. It fixes the main historical boundary, removes training observations whose future label intervals overlap the validation or evaluation interval, and confines model and threshold selection to the development data. A later audit identified an additional issue that is disclosed rather than concealed: the secondary calibration-to-evaluation boundary was not fully purged in the 12-trial ablation. This finding changes the evidentiary status of the ablation results and prevents them from being treated as confirmatory leakage-free estimates.</w:t>
+        <w:t>The protocol fixes the main historical boundary, removes training observations whose future label intervals overlap validation or evaluation, and confines model and threshold selection to the development data. In the repaired v3 rerun, the secondary calibration label endpoint was purged with the strict rule calibration_label_end_index &lt; evaluation_start_row_id; overlap_count_after_purge was zero in all 60 outer selections. This repair changes the ablation from an audit finding about a boundary defect into technically purged development evidence, while provenance_complete=false and the previously observed period still limit its evidentiary scope.</w:t>
       </w:r>
     </w:p>
     <w:p>
@@ -1978,12 +1969,12 @@
     </w:p>
     <w:p>
       <w:r>
-        <w:t>The full feature set contains 70 causal features, whereas the no-Hurst arm contains 65. Feature families include lagged returns and momentum at lags 1, 2, 3, 5, 10, and 20; trend and volatility measures over windows of 5, 10, 20, 63, and 126 days; price-range and position features; broker tick-volume summaries; Hurst estimates over 64- and 128-day windows; and 252-day regime descriptors with a minimum history of 126 observations. Every feature at time t is computed using information available no later than t.</w:t>
+        <w:t>The full feature set contains 70 causal features, whereas the no-Hurst arm contains 65. Feature families include lagged returns and momentum at lags 1, 2, 3, 5, 10, and 20; trend and volatility measures over windows of 5, 10, 20, 63, and 126 days; price-range and position features; broker tick-volume summaries; causal DFA1 estimates over 64- and 128-day windows; and 252-day regime descriptors with a minimum history of 126 observations. Every feature at time t is computed using information available no later than t. The base pipeline uses median imputation with a missing indicator, standardization, and balanced logistic regression with C=0.2, l2 penalty, lbfgs solver, max_iter=2000, tol=0.0001, and random_state=42.</w:t>
       </w:r>
     </w:p>
     <w:p>
       <w:r>
-        <w:t>The primary Hurst representation uses first-order DFA following the long-range-correlation procedure described by Kantelhardt et al. (2001). A robust regime representation is constructed from rolling historical thresholds rather than from a future-looking global threshold. A legacy rescaled-range representation is retained as a comparison arm because Hurst's original formulation and the robustness analysis of Mandelbrot and Wallis (1969) motivate its inclusion; however, it is not the basis of the main scientific interpretation.</w:t>
+        <w:t>The primary Hurst representation uses first-order DFA with the exact rolling construction described above. The robust regime representation is built from historical rolling thresholds rather than a future-looking global threshold. The v3 search also evaluated optional sigmoid calibration with C=1000000 and a minimum of 40 eligible observations containing both classes, alongside no-trade margins of 0 and 0.05. Candidate model selection used three inner folds and five outer folds under a fixed budget; a legacy rescaled-range representation remains a comparison arm in the broader protocol.</w:t>
       </w:r>
     </w:p>
     <w:p>
@@ -2618,7 +2609,7 @@
     </w:p>
     <w:p>
       <w:r>
-        <w:t>Candidate hyperparameters, model selection, and classification thresholds are determined within the development period. The same candidate model family and decision budget are used when Hurst features are removed. No model, forecast horizon, or threshold is selected after inspection of the historical evaluation results.</w:t>
+        <w:t>Candidate hyperparameters, model selection, and classification thresholds are determined within the development period. The same candidate model family, preprocessing, calibration candidates, and decision budget are used when Hurst features are removed. No model, forecast horizon, or threshold is selected after inspection of the historical evaluation results.</w:t>
       </w:r>
     </w:p>
     <w:p>
@@ -2640,7 +2631,7 @@
     </w:p>
     <w:p>
       <w:r>
-        <w:t>The design separates development decisions from the previously observed historical evaluation. However, the audit found that the secondary calibration interval used in the 12-trial ablation was not fully purged at its boundary with the evaluation interval. Because sigmoid calibration was selected in 26 of 60 outer selections, this defect is material to the evidentiary status of the ablation. The corresponding results are therefore reported descriptively and are not presented as confirmatory leakage-free estimates.</w:t>
+        <w:t>The design separates development decisions from the previously observed historical evaluation. In the repaired v3 ablation, the secondary calibration interval is endpoint-purged before evaluation: all 60 outer selections report overlap_count_after_purge=0 and secondary_calibration_purge_verified=true. This removes the recorded calibration-boundary defect from the rerun, but it does not create a pristine prospective holdout because the period was previously observed and provenance_complete=false.</w:t>
       </w:r>
     </w:p>
     <w:p>
@@ -2654,7 +2645,7 @@
     </w:p>
     <w:p>
       <w:r>
-        <w:t>The ablation contains three model arms and four forecast horizons, producing 12 pre-specified trials: (i) no Hurst features, (ii) DFA1-Hurst features, and (iii) robust Hurst regime features. Targets, model families, data splits, and decision rules are held constant across arms. The objective is to assess incremental predictive value rather than to select the best-performing model after the fact. All 12 decisions were rejected under the project's pre-specified acceptance rule.</w:t>
+        <w:t>The ablation contains three model arms and four forecast horizons, producing 12 pre-specified trials: (i) no Hurst features, (ii) DFA1-Hurst features, and (iii) robust Hurst regime features. Targets, model families, data splits, preprocessing, and decision rules are held constant across arms. All 12 promotion decisions were rejected. A paired comparison aligned row_id and y_true across the no-Hurst and DFA1 arms before estimating differences.</w:t>
       </w:r>
     </w:p>
     <w:p>
@@ -2668,11 +2659,7 @@
     </w:p>
     <w:p>
       <w:r>
-        <w:t xml:space="preserve">Performance is evaluated using balanced accuracy, macro-F1, and ROC-AUC. Balanced accuracy is the mean of sensitivity and specificity and is suitable when class proportions differ across horizons (Brodersen et al., 2010). Macro-F1 </w:t>
-      </w:r>
-      <w:r>
-        <w:lastRenderedPageBreak/>
-        <w:t>assigns equal weight to both classes, consistent with the broader analysis of classification measures by Sokolova and Lapalme (2009). Ninety-five percent intervals are estimated using a block bootstrap to preserve some temporal dependence; the base block length is 10 observations and is increased to at least the forecast horizon when necessary, following the stationary-bootstrap rationale of Künsch (1989).</w:t>
+        <w:t>Performance is evaluated using balanced accuracy, macro-F1, and ROC-AUC. Ninety-five-percent intervals for paired balanced-accuracy differences use a moving block bootstrap with block length 10 and 10,000 replicates. Two-sided sign-flip inference uses the same 10,000 block-aware permutations, and Holm adjustment is applied within each four-horizon family. These intervals and p-values communicate uncertainty; they do not substitute for prospective confirmation.</w:t>
       </w:r>
     </w:p>
     <w:p>
@@ -2694,7 +2681,7 @@
     </w:p>
     <w:p>
       <w:r>
-        <w:t>The software pipeline separates data validation, feature construction, target generation, temporal splitting, model fitting, calibration, evaluation, and report generation. The most recent recorded quality run passed 82 automated tests covering the data contract, feature causality, overlap purging, prediction boundaries, output records, and hash integrity. Raw and processed data, configurations, development and evaluation partitions, and code snapshots are identified by SHA-256 records. These controls improve traceability and reproducibility, but they do not convert a technically successful run into evidence of statistical validity or economic usefulness.</w:t>
+        <w:t>The software pipeline separates data validation, feature construction, target generation, temporal splitting, model fitting, calibration, evaluation, and report generation. The latest recorded quality run passed 97 automated tests covering data contracts, feature causality, overlap purging, prediction boundaries, output records, and hash integrity. The final v3 receipt covers 129 research outputs and 21 runtime sources. These controls improve traceability and reproducibility, but they do not convert a technically successful run into evidence of statistical validity, prospective generalization, or economic usefulness.</w:t>
       </w:r>
     </w:p>
     <w:p>
@@ -3788,12 +3775,12 @@
     </w:p>
     <w:p>
       <w:r>
-        <w:t>Table 5 compares the three ablation arms. The no-Hurst arm yields the highest point estimate at the one-day horizon (52.03%), while the robust Hurst regime arm is highest at the 5-day and 20-day horizons (50.91% and 51.24%, respectively). The DFA1-Hurst arm is not the highest-performing arm at any horizon. Because the point-estimate winner changes across horizons and all 12 decisions are rejected, the results do not show a stable pattern of incremental value from Hurst features.</w:t>
+        <w:t>Table 5 compares the three ablation arms after the repaired v3 rerun. Pooled balanced accuracy for no Hurst is 52.31%, 49.72%, 50.74%, and 49.93% at horizons 1, 5, 10, and 20 days; the corresponding DFA1-Hurst values are 50.82%, 48.78%, 47.52%, and 47.31%; robust Hurst values are 49.49%, 51.02%, 47.64%, and 50.78%. The point-estimate winner changes by horizon, and no arm demonstrates a stable cross-horizon advantage.</w:t>
       </w:r>
     </w:p>
     <w:p>
       <w:r>
-        <w:t>The highest observed ablation estimate, 52.03% balanced accuracy with 51.62% macro-F1 for the no-Hurst arm at the one-day horizon, should not be interpreted as confirmatory evidence. The audit found that, in all 60 outer selections, the secondary calibration label endpoint crossed the evaluation start; sigmoid calibration was selected 26 times. Figure 2 therefore provides only a descriptive summary of the recorded development results rather than a clean estimate of out-of-sample performance.</w:t>
+        <w:t>The paired DFA1-minus-no-Hurst contrasts are H1: -1.49 pp ([-3.09, +0.17] pp; Holm p=0.449955); H5: -0.93 pp ([-2.21, +0.27] pp; Holm p=0.449955); H10: -3.23 pp ([-6.92, +0.69] pp; Holm p=0.449955); H20: -2.62 pp ([-5.67, +0.63] pp; Holm p=0.449955). Every confidence interval includes zero and every Holm-adjusted p-value is non-significant. The robust arm has a raw H1 p-value of 0.014399 but a Holm-adjusted value of 0.057594; its other horizon contrasts are also non-significant after family adjustment. Thus the rerun supports a bounded negative finding, not a claim that Hurst information is universally useless.</w:t>
       </w:r>
     </w:p>
     <w:p>
@@ -3995,7 +3982,7 @@
                 <w:color w:val="000000"/>
                 <w:sz w:val="16"/>
               </w:rPr>
-              <w:t>Decision summary</w:t>
+              <w:t>Paired comparison vs no Hurst</w:t>
             </w:r>
           </w:p>
         </w:tc>
@@ -4051,7 +4038,7 @@
                 <w:color w:val="000000"/>
                 <w:sz w:val="16"/>
               </w:rPr>
-              <w:t>52.03</w:t>
+              <w:t>52.31%</w:t>
             </w:r>
           </w:p>
         </w:tc>
@@ -4076,7 +4063,7 @@
                 <w:color w:val="000000"/>
                 <w:sz w:val="16"/>
               </w:rPr>
-              <w:t>49.25</w:t>
+              <w:t>49.72%</w:t>
             </w:r>
           </w:p>
         </w:tc>
@@ -4101,7 +4088,7 @@
                 <w:color w:val="000000"/>
                 <w:sz w:val="16"/>
               </w:rPr>
-              <w:t>49.91</w:t>
+              <w:t>50.74%</w:t>
             </w:r>
           </w:p>
         </w:tc>
@@ -4126,7 +4113,7 @@
                 <w:color w:val="000000"/>
                 <w:sz w:val="16"/>
               </w:rPr>
-              <w:t>47.56</w:t>
+              <w:t>49.93%</w:t>
             </w:r>
           </w:p>
         </w:tc>
@@ -4151,7 +4138,7 @@
                 <w:color w:val="000000"/>
                 <w:sz w:val="16"/>
               </w:rPr>
-              <w:t>All four rejected</w:t>
+              <w:t>Reference arm</w:t>
             </w:r>
           </w:p>
         </w:tc>
@@ -4207,7 +4194,7 @@
                 <w:color w:val="000000"/>
                 <w:sz w:val="16"/>
               </w:rPr>
-              <w:t>50.54</w:t>
+              <w:t>50.82%</w:t>
             </w:r>
           </w:p>
         </w:tc>
@@ -4232,7 +4219,7 @@
                 <w:color w:val="000000"/>
                 <w:sz w:val="16"/>
               </w:rPr>
-              <w:t>48.26</w:t>
+              <w:t>48.78%</w:t>
             </w:r>
           </w:p>
         </w:tc>
@@ -4257,7 +4244,7 @@
                 <w:color w:val="000000"/>
                 <w:sz w:val="16"/>
               </w:rPr>
-              <w:t>48.27</w:t>
+              <w:t>47.52%</w:t>
             </w:r>
           </w:p>
         </w:tc>
@@ -4282,7 +4269,7 @@
                 <w:color w:val="000000"/>
                 <w:sz w:val="16"/>
               </w:rPr>
-              <w:t>48.02</w:t>
+              <w:t>47.31%</w:t>
             </w:r>
           </w:p>
         </w:tc>
@@ -4307,7 +4294,7 @@
                 <w:color w:val="000000"/>
                 <w:sz w:val="16"/>
               </w:rPr>
-              <w:t>All four rejected</w:t>
+              <w:t xml:space="preserve">H1: -1.49 pp; CI [-3.09, +0.17] pp; Holm p=0.449955. H5: -0.93 pp; CI [-2.21, +0.27] pp; Holm p=0.449955. H10: -3.23 pp; CI [-6.92, +0.69] pp; Holm p=0.449955. H20: -2.62 pp; CI [-5.67, +0.63] pp; Holm p=0.449955. </w:t>
             </w:r>
           </w:p>
         </w:tc>
@@ -4363,7 +4350,7 @@
                 <w:color w:val="000000"/>
                 <w:sz w:val="16"/>
               </w:rPr>
-              <w:t>49.49</w:t>
+              <w:t>49.49%</w:t>
             </w:r>
           </w:p>
         </w:tc>
@@ -4388,7 +4375,7 @@
                 <w:color w:val="000000"/>
                 <w:sz w:val="16"/>
               </w:rPr>
-              <w:t>50.91</w:t>
+              <w:t>51.02%</w:t>
             </w:r>
           </w:p>
         </w:tc>
@@ -4413,7 +4400,7 @@
                 <w:color w:val="000000"/>
                 <w:sz w:val="16"/>
               </w:rPr>
-              <w:t>48.64</w:t>
+              <w:t>47.64%</w:t>
             </w:r>
           </w:p>
         </w:tc>
@@ -4438,7 +4425,7 @@
                 <w:color w:val="000000"/>
                 <w:sz w:val="16"/>
               </w:rPr>
-              <w:t>51.24</w:t>
+              <w:t>50.78%</w:t>
             </w:r>
           </w:p>
         </w:tc>
@@ -4463,7 +4450,7 @@
                 <w:color w:val="000000"/>
                 <w:sz w:val="16"/>
               </w:rPr>
-              <w:t>All four rejected</w:t>
+              <w:t xml:space="preserve">H1: -2.82 pp; Holm p=0.057594. H5: +1.30 pp; Holm p=0.909309. H10: -3.10 pp; Holm p=0.440056. H20: +0.85 pp; Holm p=0.909309. </w:t>
             </w:r>
           </w:p>
         </w:tc>
@@ -4475,7 +4462,7 @@
         <w:spacing w:before="80" w:after="120" w:line="240" w:lineRule="auto"/>
       </w:pPr>
       <w:r>
-        <w:t>Source: 12-trial ablation record; values are descriptive because of the calibration-boundary defect.</w:t>
+        <w:t>Source: Finalized 12-trial v3 run executable_direction_hurst_ablation_v3-20260912T082354Z; paired_inference.json and paired_comparisons/table_5_v3.csv. All promotion decisions were rejected; provenance_complete=false.</w:t>
       </w:r>
     </w:p>
     <w:p>
@@ -4547,7 +4534,7 @@
     </w:p>
     <w:p>
       <w:r>
-        <w:t>The 82 passed automated tests show that the implementation satisfied the software contracts covered by those tests. They do not establish that the target is economically meaningful, that the sample is representative, or that the ablation is free from the documented calibration-boundary defect. This distinction is essential: engineering correctness is necessary for a forecasting claim, but it is not sufficient evidence for statistical or economic validity.</w:t>
+        <w:t>The 97 passed automated tests show that the implementation satisfied the software contracts covered by those tests, including the repaired endpoint purge and paired alignment. They do not establish that the target is economically meaningful, the sample is representative, the previously observed holdout is prospective, or the results generalize beyond the documented broker feed.</w:t>
       </w:r>
     </w:p>
     <w:p>
@@ -5698,7 +5685,7 @@
     </w:p>
     <w:p>
       <w:r>
-        <w:t>For the first research question, the candidate system does not provide sufficient evidence of stable performance above the 50% reference level. Historical balanced-accuracy values remain close to the reference level, their intervals are broad, and all four pre-specified decisions are rejected. For the second question, no Hurst-based arm dominates across horizons, and the audit prevents the 12-trial ablation from supporting a confirmatory claim of incremental value. For the third question, the available evidence is insufficient to support an economic or trading conclusion.</w:t>
+        <w:t>For the first research question, the candidate system does not provide sufficient evidence of stable performance above the 50% reference level. For the second, the paired DFA1-minus-no-Hurst contrasts are H1: -1.49 pp ([-3.09, +0.17] pp; Holm p=0.449955); H5: -0.93 pp ([-2.21, +0.27] pp; Holm p=0.449955); H10: -3.23 pp ([-6.92, +0.69] pp; Holm p=0.449955); H20: -2.62 pp ([-5.67, +0.63] pp; Holm p=0.449955); no Holm-adjusted comparison is significant, and the robust arm does not dominate across horizons. For the third, all 12 promotion decisions were rejected and the available evidence is insufficient to support an economic or trading conclusion.</w:t>
       </w:r>
     </w:p>
     <w:p>
@@ -5726,7 +5713,7 @@
     </w:p>
     <w:p>
       <w:r>
-        <w:t>The principal methodological contribution is the evaluation framework constructed around the feature hypothesis. The study fixes decision timing, separates statistical and executable targets, includes a no-Hurst control arm, applies a common temporal boundary, limits the experimental budget, reports uncertainty, and retains an auditable record of the analysis. Importantly, the framework also prevents a positive interpretation when the available scientific evidence is insufficient, even when the implementation passes its automated software tests. This makes the negative result more informative than reporting only the best isolated accuracy because it identifies which parts of the proposed claim remain unsupported.</w:t>
+        <w:t>The principal methodological contribution is the evaluation framework constructed around the feature hypothesis. The study fixes decision timing, separates statistical and executable targets, includes a no-Hurst control arm, applies a common temporal boundary, repairs the secondary calibration purge, aligns paired outcomes, limits the experimental budget, reports block-aware uncertainty, and retains an auditable record of the analysis. This makes the negative result informative without treating a single isolated accuracy as confirmatory evidence.</w:t>
       </w:r>
     </w:p>
     <w:p>
@@ -6004,7 +5991,7 @@
                 <w:color w:val="000000"/>
                 <w:sz w:val="16"/>
               </w:rPr>
-              <w:t>Point-estimate winner changes by horizon</w:t>
+              <w:t>Paired DFA1 deltas are negative at all horizons; no Holm-adjusted comparison is significant</w:t>
             </w:r>
           </w:p>
         </w:tc>
@@ -6029,7 +6016,7 @@
                 <w:color w:val="000000"/>
                 <w:sz w:val="16"/>
               </w:rPr>
-              <w:t>No stable incremental value observed</w:t>
+              <w:t>No stable incremental Hurst value demonstrated</w:t>
             </w:r>
           </w:p>
         </w:tc>
@@ -6085,7 +6072,7 @@
                 <w:color w:val="000000"/>
                 <w:sz w:val="16"/>
               </w:rPr>
-              <w:t>Incomplete overlap removal in outer selections</w:t>
+              <w:t>Endpoint purge verified; overlap count is zero in all 60 outer selections</w:t>
             </w:r>
           </w:p>
         </w:tc>
@@ -6109,7 +6096,7 @@
               <w:rPr>
                 <w:sz w:val="16"/>
               </w:rPr>
-              <w:t>Ablation results are descriptive development evidence</w:t>
+              <w:t>Technical control passed; provenance and prospective status remain limited</w:t>
             </w:r>
           </w:p>
         </w:tc>
@@ -6165,7 +6152,7 @@
                 <w:color w:val="000000"/>
                 <w:sz w:val="16"/>
               </w:rPr>
-              <w:t>Legacy overlap and incomplete inferential controls</w:t>
+              <w:t>Paired block bootstrap, sign-flip, and Holm adjustment are recorded</w:t>
             </w:r>
           </w:p>
         </w:tc>
@@ -6190,7 +6177,7 @@
                 <w:color w:val="000000"/>
                 <w:sz w:val="16"/>
               </w:rPr>
-              <w:t>No profitability or economic comparison</w:t>
+              <w:t>Uncertainty is reported; it is not a prospective guarantee</w:t>
             </w:r>
           </w:p>
         </w:tc>
@@ -6310,12 +6297,12 @@
     </w:p>
     <w:p>
       <w:r>
-        <w:t>Third, the 12-trial ablation contains a documented defect at the secondary calibration-to-evaluation boundary. The results are retained for transparency but are not interpreted as clean confirmatory evidence.</w:t>
+        <w:t>Third, the 12-trial ablation's secondary calibration-to-evaluation boundary was repaired and verified with zero overlap in all 60 outer selections, but the rerun remains development evidence because the historical period was previously observed and provenance_complete=false.</w:t>
       </w:r>
     </w:p>
     <w:p>
       <w:r>
-        <w:t>Fourth, the block-bootstrap procedure and family-level inference are limited. The reported intervals communicate uncertainty, but they do not substitute for a stronger paired and horizon-aware inferential design.</w:t>
+        <w:t>Fourth, the paired block-bootstrap and sign-flip procedures with family-level Holm adjustment improve the comparison, but finite-sample dependence, overlapping multi-day targets, and the single feed still limit inferential strength.</w:t>
       </w:r>
     </w:p>
     <w:p>
@@ -6338,17 +6325,17 @@
     </w:p>
     <w:p>
       <w:r>
-        <w:t>This study evaluated whether Hurst-based regime features provide stable incremental value for multi-horizon daily XAUUSD direction forecasting. Across the 1-, 5-, 10-, and 20-day horizons, the previously observed historical evaluation produced balanced accuracy values between 50.38% and 52.19%, and all four pre-specified decisions were rejected. The 12-trial ablation likewise failed to show a stable Hurst advantage, while the documented calibration-boundary defect limits the evidentiary status of those ablation results.</w:t>
+        <w:t>This study evaluated whether Hurst-based regime features provide stable incremental value for multi-horizon daily XAUUSD direction forecasting. The repaired v3 rerun covered 12 trials across four horizons and three arms. No Hurst yielded the highest pooled balanced accuracy at H1, H10, and H20, while robust Hurst was highest at H5; DFA1-Hurst was below no Hurst at every horizon. The paired DFA1-minus-no-Hurst contrasts were negative at all horizons, with confidence intervals covering zero and Holm-adjusted p-values of 0.449955.</w:t>
       </w:r>
     </w:p>
     <w:p>
       <w:r>
-        <w:t>The defensible conclusion is therefore narrow: given the documented data source and evaluation protocol, the evidence does not demonstrate stable directional skill, stable incremental predictive value from Hurst features, or reliable trading profitability. The study's principal value lies in its auditable negative finding, its explicit separation of statistical and executable targets, and its source-to-idea and data-provenance records, which make the limits of the claim transparent and inspectable.</w:t>
+        <w:t>The defensible conclusion is therefore narrow: given the documented data source and repaired evaluation protocol, the evidence does not demonstrate stable directional skill, stable incremental predictive value from Hurst features, or reliable trading profitability. The purge repair and paired inference strengthen the technical audit trail, while the previously observed period and provenance_complete=false prevent a prospective or broadly generalizable claim. The study's principal value lies in making that negative finding transparent and reproducible.</w:t>
       </w:r>
     </w:p>
     <w:p>
       <w:r>
-        <w:t>Future work should first repair the calibration purge and rerun the complete development process. The resulting locked design should then be evaluated on strictly prospective data that have not previously been observed or used during model development. Future studies should preserve the common-calendar comparison, maintain point-in-time provenance for broker session conventions, strengthen paired and horizon-aware inference, and introduce external macroeconomic variables only within a new pre-registered design. Until these steps are completed, the current results should not be presented as evidence of a deployable trading system or as an investment recommendation.</w:t>
+        <w:t>Future work should evaluate the locked design on strictly prospective data that have not been observed or used during model development. It should preserve the endpoint-aware calibration purge, common-calendar comparison, paired and horizon-aware inference, point-in-time provenance for broker conventions, and a pre-registered budget. External macroeconomic variables or alternative Hurst estimators should be introduced only within a new prospective design. Until then, the current results should not be presented as evidence of a deployable trading system or as an investment recommendation.</w:t>
       </w:r>
     </w:p>
     <w:p>
@@ -6366,7 +6353,7 @@
     </w:p>
     <w:p>
       <w:r>
-        <w:t>Data Availability Statement: The code, configurations, manifests, and evidence files are available in the public repository on the thesis-v2-rebuild branch at commit 86404f3c10450cccac46deb962c1002290d82d8a. The raw broker-provided series depend on the MetaQuotes-Demo contract and data version; therefore, the study reports recorded hashes and reconstruction rules without claiming equivalence to another broker feed.</w:t>
+        <w:t>Data Availability Statement: The code, configurations, manifests, finalization record, paired comparisons, and evidence files are available in the public repository on branch codex/hurst-ablation-v3-repair for the finalized run executable_direction_hurst_ablation_v3-20260912T082354Z. The raw broker-provided series depend on the MetaQuotes-Demo contract and data version; therefore, the study reports recorded hashes and reconstruction rules without claiming equivalence to another broker feed.</w:t>
       </w:r>
     </w:p>
     <w:p>
@@ -6401,7 +6388,7 @@
     </w:p>
     <w:p>
       <w:r>
-        <w:t>The reported results are based on the audited thesis artifacts and the frozen repository record; no new experimental run was conducted to generate the values presented in this article. A software rerun should use the thesis configuration and recorded quality checks while recognizing the limitations associated with the broker contract and data provenance.</w:t>
+        <w:t>The reported values are based on the finalized, repaired v3 run rather than on the earlier unrepaired record. Reproduction should use the committed protocol, the finalization and registry records, the paired-comparison artifacts, and the recorded quality checks while recognizing the limitations associated with the broker contract, previously observed evaluation period, and incomplete provenance.</w:t>
       </w:r>
     </w:p>
     <w:p>
@@ -6565,7 +6552,7 @@
         <w:rPr>
           <w:color w:val="000000"/>
         </w:rPr>
-        <w:t>HGE Gold Forecasting Repository. (2026). Stable thesis source snapshot, branch thesis-v2-rebuild, commit 86404f3c10450cccac46deb962c1002290d82d8a. GitHub. https://github.com/leonardo0231/hurst-gated-gold-forecasting/commit/86404f3c10450cccac46deb962c1002290d82d8a</w:t>
+        <w:t>HGE Gold Forecasting Repository. (2026). Finalized Hurst-ablation v3 record, branch codex/hurst-ablation-v3-repair, run executable_direction_hurst_ablation_v3-20260912T082354Z. GitHub. https://github.com/leonardo0231/hurst-gated-gold-forecasting</w:t>
       </w:r>
     </w:p>
     <w:p>

</xml_diff>